<commit_message>
docs(acpos): replace generic bindings with source-grounded exact closure
</commit_message>
<xml_diff>
--- a/00_INDEX_ACPOS_Mother_Compliant_Basic_Design_Master.docx
+++ b/00_INDEX_ACPOS_Mother_Compliant_Basic_Design_Master.docx
@@ -6027,11 +6027,1340 @@
         <w:t>這一包是「最完整方向的 Basic Design Draft」，不是施工證據。每頁均已建立完整 artifacts 與 8 種視覺候選，但正式 DESIGN_FROZEN 仍需 Human Visual/Functional Review，並在核准後把變更 materialize 回既有 Current Authority owner。未經該步驟，不得直接施工。</w:t>
       </w:r>
     </w:p>
+    <w:p>
+      <w:pPr>
+        <w:sectPr>
+          <w:headerReference w:type="default" r:id="rId9"/>
+          <w:footerReference w:type="default" r:id="rId10"/>
+          <w:pgSz w:w="16834" w:h="11909" w:orient="landscape"/>
+          <w:pgMar w:top="605" w:right="648" w:bottom="576" w:left="648" w:header="720" w:footer="720" w:gutter="0"/>
+          <w:cols w:space="720"/>
+          <w:docGrid w:linePitch="360"/>
+        </w:sectPr>
+      </w:pPr>
+    </w:p>
+    <w:p>
+      <w:pPr>
+        <w:pStyle w:val="Heading1"/>
+      </w:pPr>
+      <w:r>
+        <w:t>2026-09-21 Source-Grounded Construction Closure Index</w:t>
+      </w:r>
+    </w:p>
+    <w:p>
+      <w:r>
+        <w:rPr>
+          <w:b/>
+        </w:rPr>
+        <w:t xml:space="preserve">[ACPOS-20260921-SOURCE-GROUNDED-CONSTRUCTION-CLOSURE-V1] </w:t>
+      </w:r>
+      <w:r>
+        <w:t>Source-grounded only. Existing Current source wins; missing source values remain blocked/decision-required. This closure supersedes the prior generic 2026-09-21 V1/V3 annex only, not the original domain logic or human visual review gates.</w:t>
+      </w:r>
+    </w:p>
+    <w:tbl>
+      <w:tblPr>
+        <w:tblStyle w:val="TableGrid"/>
+        <w:tblW w:type="auto" w:w="0"/>
+        <w:tblLook w:firstColumn="1" w:firstRow="1" w:lastColumn="0" w:lastRow="0" w:noHBand="0" w:noVBand="1" w:val="04A0"/>
+      </w:tblPr>
+      <w:tblGrid>
+        <w:gridCol w:w="2180"/>
+        <w:gridCol w:w="2180"/>
+        <w:gridCol w:w="2180"/>
+        <w:gridCol w:w="2180"/>
+        <w:gridCol w:w="2180"/>
+      </w:tblGrid>
+      <w:tr>
+        <w:trPr>
+          <w:tblHeader w:val="true"/>
+        </w:trPr>
+        <w:tc>
+          <w:tcPr>
+            <w:tcW w:type="dxa" w:w="2180"/>
+            <w:shd w:fill="EDE9FE"/>
+          </w:tcPr>
+          <w:p>
+            <w:r>
+              <w:rPr>
+                <w:sz w:val="13"/>
+              </w:rPr>
+              <w:t>Page</w:t>
+            </w:r>
+          </w:p>
+        </w:tc>
+        <w:tc>
+          <w:tcPr>
+            <w:tcW w:type="dxa" w:w="2180"/>
+            <w:shd w:fill="EDE9FE"/>
+          </w:tcPr>
+          <w:p>
+            <w:r>
+              <w:rPr>
+                <w:sz w:val="13"/>
+              </w:rPr>
+              <w:t>Expected Controls</w:t>
+            </w:r>
+          </w:p>
+        </w:tc>
+        <w:tc>
+          <w:tcPr>
+            <w:tcW w:type="dxa" w:w="2180"/>
+            <w:shd w:fill="EDE9FE"/>
+          </w:tcPr>
+          <w:p>
+            <w:r>
+              <w:rPr>
+                <w:sz w:val="13"/>
+              </w:rPr>
+              <w:t>Exact Rows</w:t>
+            </w:r>
+          </w:p>
+        </w:tc>
+        <w:tc>
+          <w:tcPr>
+            <w:tcW w:type="dxa" w:w="2180"/>
+            <w:shd w:fill="EDE9FE"/>
+          </w:tcPr>
+          <w:p>
+            <w:r>
+              <w:rPr>
+                <w:sz w:val="13"/>
+              </w:rPr>
+              <w:t>Denominator</w:t>
+            </w:r>
+          </w:p>
+        </w:tc>
+        <w:tc>
+          <w:tcPr>
+            <w:tcW w:type="dxa" w:w="2180"/>
+            <w:shd w:fill="EDE9FE"/>
+          </w:tcPr>
+          <w:p>
+            <w:r>
+              <w:rPr>
+                <w:sz w:val="13"/>
+              </w:rPr>
+              <w:t>True Runtime / Governance Status</w:t>
+            </w:r>
+          </w:p>
+        </w:tc>
+      </w:tr>
+      <w:tr>
+        <w:tc>
+          <w:tcPr>
+            <w:tcW w:type="dxa" w:w="2180"/>
+          </w:tcPr>
+          <w:p>
+            <w:r>
+              <w:rPr>
+                <w:sz w:val="13"/>
+              </w:rPr>
+              <w:t>WB-01</w:t>
+            </w:r>
+          </w:p>
+        </w:tc>
+        <w:tc>
+          <w:tcPr>
+            <w:tcW w:type="dxa" w:w="2180"/>
+          </w:tcPr>
+          <w:p>
+            <w:r>
+              <w:rPr>
+                <w:sz w:val="13"/>
+              </w:rPr>
+              <w:t>14</w:t>
+            </w:r>
+          </w:p>
+        </w:tc>
+        <w:tc>
+          <w:tcPr>
+            <w:tcW w:type="dxa" w:w="2180"/>
+          </w:tcPr>
+          <w:p>
+            <w:r>
+              <w:rPr>
+                <w:sz w:val="13"/>
+              </w:rPr>
+              <w:t>14</w:t>
+            </w:r>
+          </w:p>
+        </w:tc>
+        <w:tc>
+          <w:tcPr>
+            <w:tcW w:type="dxa" w:w="2180"/>
+          </w:tcPr>
+          <w:p>
+            <w:r>
+              <w:rPr>
+                <w:sz w:val="13"/>
+              </w:rPr>
+              <w:t>PASS</w:t>
+            </w:r>
+          </w:p>
+        </w:tc>
+        <w:tc>
+          <w:tcPr>
+            <w:tcW w:type="dxa" w:w="2180"/>
+          </w:tcPr>
+          <w:p>
+            <w:r>
+              <w:rPr>
+                <w:sz w:val="13"/>
+              </w:rPr>
+              <w:t>NO_DEFINITION_GAP</w:t>
+            </w:r>
+          </w:p>
+        </w:tc>
+      </w:tr>
+      <w:tr>
+        <w:tc>
+          <w:tcPr>
+            <w:tcW w:type="dxa" w:w="2180"/>
+          </w:tcPr>
+          <w:p>
+            <w:r>
+              <w:rPr>
+                <w:sz w:val="13"/>
+              </w:rPr>
+              <w:t>CORE-01</w:t>
+            </w:r>
+          </w:p>
+        </w:tc>
+        <w:tc>
+          <w:tcPr>
+            <w:tcW w:type="dxa" w:w="2180"/>
+          </w:tcPr>
+          <w:p>
+            <w:r>
+              <w:rPr>
+                <w:sz w:val="13"/>
+              </w:rPr>
+              <w:t>50</w:t>
+            </w:r>
+          </w:p>
+        </w:tc>
+        <w:tc>
+          <w:tcPr>
+            <w:tcW w:type="dxa" w:w="2180"/>
+          </w:tcPr>
+          <w:p>
+            <w:r>
+              <w:rPr>
+                <w:sz w:val="13"/>
+              </w:rPr>
+              <w:t>50</w:t>
+            </w:r>
+          </w:p>
+        </w:tc>
+        <w:tc>
+          <w:tcPr>
+            <w:tcW w:type="dxa" w:w="2180"/>
+          </w:tcPr>
+          <w:p>
+            <w:r>
+              <w:rPr>
+                <w:sz w:val="13"/>
+              </w:rPr>
+              <w:t>PASS</w:t>
+            </w:r>
+          </w:p>
+        </w:tc>
+        <w:tc>
+          <w:tcPr>
+            <w:tcW w:type="dxa" w:w="2180"/>
+          </w:tcPr>
+          <w:p>
+            <w:r>
+              <w:rPr>
+                <w:sz w:val="13"/>
+              </w:rPr>
+              <w:t>NO_DEFINITION_GAP</w:t>
+            </w:r>
+          </w:p>
+        </w:tc>
+      </w:tr>
+      <w:tr>
+        <w:tc>
+          <w:tcPr>
+            <w:tcW w:type="dxa" w:w="2180"/>
+          </w:tcPr>
+          <w:p>
+            <w:r>
+              <w:rPr>
+                <w:sz w:val="13"/>
+              </w:rPr>
+              <w:t>ASSET-01</w:t>
+            </w:r>
+          </w:p>
+        </w:tc>
+        <w:tc>
+          <w:tcPr>
+            <w:tcW w:type="dxa" w:w="2180"/>
+          </w:tcPr>
+          <w:p>
+            <w:r>
+              <w:rPr>
+                <w:sz w:val="13"/>
+              </w:rPr>
+              <w:t>85</w:t>
+            </w:r>
+          </w:p>
+        </w:tc>
+        <w:tc>
+          <w:tcPr>
+            <w:tcW w:type="dxa" w:w="2180"/>
+          </w:tcPr>
+          <w:p>
+            <w:r>
+              <w:rPr>
+                <w:sz w:val="13"/>
+              </w:rPr>
+              <w:t>85</w:t>
+            </w:r>
+          </w:p>
+        </w:tc>
+        <w:tc>
+          <w:tcPr>
+            <w:tcW w:type="dxa" w:w="2180"/>
+          </w:tcPr>
+          <w:p>
+            <w:r>
+              <w:rPr>
+                <w:sz w:val="13"/>
+              </w:rPr>
+              <w:t>PASS</w:t>
+            </w:r>
+          </w:p>
+        </w:tc>
+        <w:tc>
+          <w:tcPr>
+            <w:tcW w:type="dxa" w:w="2180"/>
+          </w:tcPr>
+          <w:p>
+            <w:r>
+              <w:rPr>
+                <w:sz w:val="13"/>
+              </w:rPr>
+              <w:t>NO_DEFINITION_GAP</w:t>
+            </w:r>
+          </w:p>
+        </w:tc>
+      </w:tr>
+      <w:tr>
+        <w:tc>
+          <w:tcPr>
+            <w:tcW w:type="dxa" w:w="2180"/>
+          </w:tcPr>
+          <w:p>
+            <w:r>
+              <w:rPr>
+                <w:sz w:val="13"/>
+              </w:rPr>
+              <w:t>VIDEO-01</w:t>
+            </w:r>
+          </w:p>
+        </w:tc>
+        <w:tc>
+          <w:tcPr>
+            <w:tcW w:type="dxa" w:w="2180"/>
+          </w:tcPr>
+          <w:p>
+            <w:r>
+              <w:rPr>
+                <w:sz w:val="13"/>
+              </w:rPr>
+              <w:t>85</w:t>
+            </w:r>
+          </w:p>
+        </w:tc>
+        <w:tc>
+          <w:tcPr>
+            <w:tcW w:type="dxa" w:w="2180"/>
+          </w:tcPr>
+          <w:p>
+            <w:r>
+              <w:rPr>
+                <w:sz w:val="13"/>
+              </w:rPr>
+              <w:t>85</w:t>
+            </w:r>
+          </w:p>
+        </w:tc>
+        <w:tc>
+          <w:tcPr>
+            <w:tcW w:type="dxa" w:w="2180"/>
+          </w:tcPr>
+          <w:p>
+            <w:r>
+              <w:rPr>
+                <w:sz w:val="13"/>
+              </w:rPr>
+              <w:t>PASS</w:t>
+            </w:r>
+          </w:p>
+        </w:tc>
+        <w:tc>
+          <w:tcPr>
+            <w:tcW w:type="dxa" w:w="2180"/>
+          </w:tcPr>
+          <w:p>
+            <w:r>
+              <w:rPr>
+                <w:sz w:val="13"/>
+              </w:rPr>
+              <w:t>NO_DEFINITION_GAP</w:t>
+            </w:r>
+          </w:p>
+        </w:tc>
+      </w:tr>
+      <w:tr>
+        <w:tc>
+          <w:tcPr>
+            <w:tcW w:type="dxa" w:w="2180"/>
+          </w:tcPr>
+          <w:p>
+            <w:r>
+              <w:rPr>
+                <w:sz w:val="13"/>
+              </w:rPr>
+              <w:t>EDIT-01</w:t>
+            </w:r>
+          </w:p>
+        </w:tc>
+        <w:tc>
+          <w:tcPr>
+            <w:tcW w:type="dxa" w:w="2180"/>
+          </w:tcPr>
+          <w:p>
+            <w:r>
+              <w:rPr>
+                <w:sz w:val="13"/>
+              </w:rPr>
+              <w:t>160</w:t>
+            </w:r>
+          </w:p>
+        </w:tc>
+        <w:tc>
+          <w:tcPr>
+            <w:tcW w:type="dxa" w:w="2180"/>
+          </w:tcPr>
+          <w:p>
+            <w:r>
+              <w:rPr>
+                <w:sz w:val="13"/>
+              </w:rPr>
+              <w:t>160</w:t>
+            </w:r>
+          </w:p>
+        </w:tc>
+        <w:tc>
+          <w:tcPr>
+            <w:tcW w:type="dxa" w:w="2180"/>
+          </w:tcPr>
+          <w:p>
+            <w:r>
+              <w:rPr>
+                <w:sz w:val="13"/>
+              </w:rPr>
+              <w:t>PASS</w:t>
+            </w:r>
+          </w:p>
+        </w:tc>
+        <w:tc>
+          <w:tcPr>
+            <w:tcW w:type="dxa" w:w="2180"/>
+          </w:tcPr>
+          <w:p>
+            <w:r>
+              <w:rPr>
+                <w:sz w:val="13"/>
+              </w:rPr>
+              <w:t>STALE_DERIVED_VALIDATION_COUNT</w:t>
+            </w:r>
+          </w:p>
+        </w:tc>
+      </w:tr>
+      <w:tr>
+        <w:tc>
+          <w:tcPr>
+            <w:tcW w:type="dxa" w:w="2180"/>
+          </w:tcPr>
+          <w:p>
+            <w:r>
+              <w:rPr>
+                <w:sz w:val="13"/>
+              </w:rPr>
+              <w:t>QA-01</w:t>
+            </w:r>
+          </w:p>
+        </w:tc>
+        <w:tc>
+          <w:tcPr>
+            <w:tcW w:type="dxa" w:w="2180"/>
+          </w:tcPr>
+          <w:p>
+            <w:r>
+              <w:rPr>
+                <w:sz w:val="13"/>
+              </w:rPr>
+              <w:t>87</w:t>
+            </w:r>
+          </w:p>
+        </w:tc>
+        <w:tc>
+          <w:tcPr>
+            <w:tcW w:type="dxa" w:w="2180"/>
+          </w:tcPr>
+          <w:p>
+            <w:r>
+              <w:rPr>
+                <w:sz w:val="13"/>
+              </w:rPr>
+              <w:t>87</w:t>
+            </w:r>
+          </w:p>
+        </w:tc>
+        <w:tc>
+          <w:tcPr>
+            <w:tcW w:type="dxa" w:w="2180"/>
+          </w:tcPr>
+          <w:p>
+            <w:r>
+              <w:rPr>
+                <w:sz w:val="13"/>
+              </w:rPr>
+              <w:t>PASS</w:t>
+            </w:r>
+          </w:p>
+        </w:tc>
+        <w:tc>
+          <w:tcPr>
+            <w:tcW w:type="dxa" w:w="2180"/>
+          </w:tcPr>
+          <w:p>
+            <w:r>
+              <w:rPr>
+                <w:sz w:val="13"/>
+              </w:rPr>
+              <w:t>NO_DEFINITION_GAP</w:t>
+            </w:r>
+          </w:p>
+        </w:tc>
+      </w:tr>
+      <w:tr>
+        <w:tc>
+          <w:tcPr>
+            <w:tcW w:type="dxa" w:w="2180"/>
+          </w:tcPr>
+          <w:p>
+            <w:r>
+              <w:rPr>
+                <w:sz w:val="13"/>
+              </w:rPr>
+              <w:t>DB-01</w:t>
+            </w:r>
+          </w:p>
+        </w:tc>
+        <w:tc>
+          <w:tcPr>
+            <w:tcW w:type="dxa" w:w="2180"/>
+          </w:tcPr>
+          <w:p>
+            <w:r>
+              <w:rPr>
+                <w:sz w:val="13"/>
+              </w:rPr>
+              <w:t>49</w:t>
+            </w:r>
+          </w:p>
+        </w:tc>
+        <w:tc>
+          <w:tcPr>
+            <w:tcW w:type="dxa" w:w="2180"/>
+          </w:tcPr>
+          <w:p>
+            <w:r>
+              <w:rPr>
+                <w:sz w:val="13"/>
+              </w:rPr>
+              <w:t>49</w:t>
+            </w:r>
+          </w:p>
+        </w:tc>
+        <w:tc>
+          <w:tcPr>
+            <w:tcW w:type="dxa" w:w="2180"/>
+          </w:tcPr>
+          <w:p>
+            <w:r>
+              <w:rPr>
+                <w:sz w:val="13"/>
+              </w:rPr>
+              <w:t>PASS</w:t>
+            </w:r>
+          </w:p>
+        </w:tc>
+        <w:tc>
+          <w:tcPr>
+            <w:tcW w:type="dxa" w:w="2180"/>
+          </w:tcPr>
+          <w:p>
+            <w:r>
+              <w:rPr>
+                <w:sz w:val="13"/>
+              </w:rPr>
+              <w:t>NO_DEFINITION_GAP</w:t>
+            </w:r>
+          </w:p>
+        </w:tc>
+      </w:tr>
+      <w:tr>
+        <w:tc>
+          <w:tcPr>
+            <w:tcW w:type="dxa" w:w="2180"/>
+          </w:tcPr>
+          <w:p>
+            <w:r>
+              <w:rPr>
+                <w:sz w:val="13"/>
+              </w:rPr>
+              <w:t>STR-01</w:t>
+            </w:r>
+          </w:p>
+        </w:tc>
+        <w:tc>
+          <w:tcPr>
+            <w:tcW w:type="dxa" w:w="2180"/>
+          </w:tcPr>
+          <w:p>
+            <w:r>
+              <w:rPr>
+                <w:sz w:val="13"/>
+              </w:rPr>
+              <w:t>57</w:t>
+            </w:r>
+          </w:p>
+        </w:tc>
+        <w:tc>
+          <w:tcPr>
+            <w:tcW w:type="dxa" w:w="2180"/>
+          </w:tcPr>
+          <w:p>
+            <w:r>
+              <w:rPr>
+                <w:sz w:val="13"/>
+              </w:rPr>
+              <w:t>57</w:t>
+            </w:r>
+          </w:p>
+        </w:tc>
+        <w:tc>
+          <w:tcPr>
+            <w:tcW w:type="dxa" w:w="2180"/>
+          </w:tcPr>
+          <w:p>
+            <w:r>
+              <w:rPr>
+                <w:sz w:val="13"/>
+              </w:rPr>
+              <w:t>PASS</w:t>
+            </w:r>
+          </w:p>
+        </w:tc>
+        <w:tc>
+          <w:tcPr>
+            <w:tcW w:type="dxa" w:w="2180"/>
+          </w:tcPr>
+          <w:p>
+            <w:r>
+              <w:rPr>
+                <w:sz w:val="13"/>
+              </w:rPr>
+              <w:t>NO_DEFINITION_GAP</w:t>
+            </w:r>
+          </w:p>
+        </w:tc>
+      </w:tr>
+      <w:tr>
+        <w:tc>
+          <w:tcPr>
+            <w:tcW w:type="dxa" w:w="2180"/>
+          </w:tcPr>
+          <w:p>
+            <w:r>
+              <w:rPr>
+                <w:sz w:val="13"/>
+              </w:rPr>
+              <w:t>INFO-01</w:t>
+            </w:r>
+          </w:p>
+        </w:tc>
+        <w:tc>
+          <w:tcPr>
+            <w:tcW w:type="dxa" w:w="2180"/>
+          </w:tcPr>
+          <w:p>
+            <w:r>
+              <w:rPr>
+                <w:sz w:val="13"/>
+              </w:rPr>
+              <w:t>66</w:t>
+            </w:r>
+          </w:p>
+        </w:tc>
+        <w:tc>
+          <w:tcPr>
+            <w:tcW w:type="dxa" w:w="2180"/>
+          </w:tcPr>
+          <w:p>
+            <w:r>
+              <w:rPr>
+                <w:sz w:val="13"/>
+              </w:rPr>
+              <w:t>66</w:t>
+            </w:r>
+          </w:p>
+        </w:tc>
+        <w:tc>
+          <w:tcPr>
+            <w:tcW w:type="dxa" w:w="2180"/>
+          </w:tcPr>
+          <w:p>
+            <w:r>
+              <w:rPr>
+                <w:sz w:val="13"/>
+              </w:rPr>
+              <w:t>PASS</w:t>
+            </w:r>
+          </w:p>
+        </w:tc>
+        <w:tc>
+          <w:tcPr>
+            <w:tcW w:type="dxa" w:w="2180"/>
+          </w:tcPr>
+          <w:p>
+            <w:r>
+              <w:rPr>
+                <w:sz w:val="13"/>
+              </w:rPr>
+              <w:t>NO_DEFINITION_GAP</w:t>
+            </w:r>
+          </w:p>
+        </w:tc>
+      </w:tr>
+      <w:tr>
+        <w:tc>
+          <w:tcPr>
+            <w:tcW w:type="dxa" w:w="2180"/>
+          </w:tcPr>
+          <w:p>
+            <w:r>
+              <w:rPr>
+                <w:sz w:val="13"/>
+              </w:rPr>
+              <w:t>SYS-01</w:t>
+            </w:r>
+          </w:p>
+        </w:tc>
+        <w:tc>
+          <w:tcPr>
+            <w:tcW w:type="dxa" w:w="2180"/>
+          </w:tcPr>
+          <w:p>
+            <w:r>
+              <w:rPr>
+                <w:sz w:val="13"/>
+              </w:rPr>
+              <w:t>12</w:t>
+            </w:r>
+          </w:p>
+        </w:tc>
+        <w:tc>
+          <w:tcPr>
+            <w:tcW w:type="dxa" w:w="2180"/>
+          </w:tcPr>
+          <w:p>
+            <w:r>
+              <w:rPr>
+                <w:sz w:val="13"/>
+              </w:rPr>
+              <w:t>12</w:t>
+            </w:r>
+          </w:p>
+        </w:tc>
+        <w:tc>
+          <w:tcPr>
+            <w:tcW w:type="dxa" w:w="2180"/>
+          </w:tcPr>
+          <w:p>
+            <w:r>
+              <w:rPr>
+                <w:sz w:val="13"/>
+              </w:rPr>
+              <w:t>PASS</w:t>
+            </w:r>
+          </w:p>
+        </w:tc>
+        <w:tc>
+          <w:tcPr>
+            <w:tcW w:type="dxa" w:w="2180"/>
+          </w:tcPr>
+          <w:p>
+            <w:r>
+              <w:rPr>
+                <w:sz w:val="13"/>
+              </w:rPr>
+              <w:t>NO_DEFINITION_GAP</w:t>
+            </w:r>
+          </w:p>
+        </w:tc>
+      </w:tr>
+      <w:tr>
+        <w:tc>
+          <w:tcPr>
+            <w:tcW w:type="dxa" w:w="2180"/>
+          </w:tcPr>
+          <w:p>
+            <w:r>
+              <w:rPr>
+                <w:sz w:val="13"/>
+              </w:rPr>
+              <w:t>IAM-01</w:t>
+            </w:r>
+          </w:p>
+        </w:tc>
+        <w:tc>
+          <w:tcPr>
+            <w:tcW w:type="dxa" w:w="2180"/>
+          </w:tcPr>
+          <w:p>
+            <w:r>
+              <w:rPr>
+                <w:sz w:val="13"/>
+              </w:rPr>
+              <w:t>14</w:t>
+            </w:r>
+          </w:p>
+        </w:tc>
+        <w:tc>
+          <w:tcPr>
+            <w:tcW w:type="dxa" w:w="2180"/>
+          </w:tcPr>
+          <w:p>
+            <w:r>
+              <w:rPr>
+                <w:sz w:val="13"/>
+              </w:rPr>
+              <w:t>14</w:t>
+            </w:r>
+          </w:p>
+        </w:tc>
+        <w:tc>
+          <w:tcPr>
+            <w:tcW w:type="dxa" w:w="2180"/>
+          </w:tcPr>
+          <w:p>
+            <w:r>
+              <w:rPr>
+                <w:sz w:val="13"/>
+              </w:rPr>
+              <w:t>PASS</w:t>
+            </w:r>
+          </w:p>
+        </w:tc>
+        <w:tc>
+          <w:tcPr>
+            <w:tcW w:type="dxa" w:w="2180"/>
+          </w:tcPr>
+          <w:p>
+            <w:r>
+              <w:rPr>
+                <w:sz w:val="13"/>
+              </w:rPr>
+              <w:t>NO_DEFINITION_GAP</w:t>
+            </w:r>
+          </w:p>
+        </w:tc>
+      </w:tr>
+      <w:tr>
+        <w:tc>
+          <w:tcPr>
+            <w:tcW w:type="dxa" w:w="2180"/>
+          </w:tcPr>
+          <w:p>
+            <w:r>
+              <w:rPr>
+                <w:sz w:val="13"/>
+              </w:rPr>
+              <w:t>DEV-01</w:t>
+            </w:r>
+          </w:p>
+        </w:tc>
+        <w:tc>
+          <w:tcPr>
+            <w:tcW w:type="dxa" w:w="2180"/>
+          </w:tcPr>
+          <w:p>
+            <w:r>
+              <w:rPr>
+                <w:sz w:val="13"/>
+              </w:rPr>
+              <w:t>22</w:t>
+            </w:r>
+          </w:p>
+        </w:tc>
+        <w:tc>
+          <w:tcPr>
+            <w:tcW w:type="dxa" w:w="2180"/>
+          </w:tcPr>
+          <w:p>
+            <w:r>
+              <w:rPr>
+                <w:sz w:val="13"/>
+              </w:rPr>
+              <w:t>22</w:t>
+            </w:r>
+          </w:p>
+        </w:tc>
+        <w:tc>
+          <w:tcPr>
+            <w:tcW w:type="dxa" w:w="2180"/>
+          </w:tcPr>
+          <w:p>
+            <w:r>
+              <w:rPr>
+                <w:sz w:val="13"/>
+              </w:rPr>
+              <w:t>PASS</w:t>
+            </w:r>
+          </w:p>
+        </w:tc>
+        <w:tc>
+          <w:tcPr>
+            <w:tcW w:type="dxa" w:w="2180"/>
+          </w:tcPr>
+          <w:p>
+            <w:r>
+              <w:rPr>
+                <w:sz w:val="13"/>
+              </w:rPr>
+              <w:t>NO_DEFINITION_GAP</w:t>
+            </w:r>
+          </w:p>
+        </w:tc>
+      </w:tr>
+      <w:tr>
+        <w:tc>
+          <w:tcPr>
+            <w:tcW w:type="dxa" w:w="2180"/>
+          </w:tcPr>
+          <w:p>
+            <w:r>
+              <w:rPr>
+                <w:sz w:val="13"/>
+              </w:rPr>
+              <w:t>SOC-01</w:t>
+            </w:r>
+          </w:p>
+        </w:tc>
+        <w:tc>
+          <w:tcPr>
+            <w:tcW w:type="dxa" w:w="2180"/>
+          </w:tcPr>
+          <w:p>
+            <w:r>
+              <w:rPr>
+                <w:sz w:val="13"/>
+              </w:rPr>
+              <w:t>67</w:t>
+            </w:r>
+          </w:p>
+        </w:tc>
+        <w:tc>
+          <w:tcPr>
+            <w:tcW w:type="dxa" w:w="2180"/>
+          </w:tcPr>
+          <w:p>
+            <w:r>
+              <w:rPr>
+                <w:sz w:val="13"/>
+              </w:rPr>
+              <w:t>67</w:t>
+            </w:r>
+          </w:p>
+        </w:tc>
+        <w:tc>
+          <w:tcPr>
+            <w:tcW w:type="dxa" w:w="2180"/>
+          </w:tcPr>
+          <w:p>
+            <w:r>
+              <w:rPr>
+                <w:sz w:val="13"/>
+              </w:rPr>
+              <w:t>PASS</w:t>
+            </w:r>
+          </w:p>
+        </w:tc>
+        <w:tc>
+          <w:tcPr>
+            <w:tcW w:type="dxa" w:w="2180"/>
+          </w:tcPr>
+          <w:p>
+            <w:r>
+              <w:rPr>
+                <w:sz w:val="13"/>
+              </w:rPr>
+              <w:t>NO_DEFINITION_GAP</w:t>
+            </w:r>
+          </w:p>
+        </w:tc>
+      </w:tr>
+      <w:tr>
+        <w:tc>
+          <w:tcPr>
+            <w:tcW w:type="dxa" w:w="2180"/>
+          </w:tcPr>
+          <w:p>
+            <w:r>
+              <w:rPr>
+                <w:sz w:val="13"/>
+              </w:rPr>
+              <w:t>ERP-01</w:t>
+            </w:r>
+          </w:p>
+        </w:tc>
+        <w:tc>
+          <w:tcPr>
+            <w:tcW w:type="dxa" w:w="2180"/>
+          </w:tcPr>
+          <w:p>
+            <w:r>
+              <w:rPr>
+                <w:sz w:val="13"/>
+              </w:rPr>
+              <w:t>42</w:t>
+            </w:r>
+          </w:p>
+        </w:tc>
+        <w:tc>
+          <w:tcPr>
+            <w:tcW w:type="dxa" w:w="2180"/>
+          </w:tcPr>
+          <w:p>
+            <w:r>
+              <w:rPr>
+                <w:sz w:val="13"/>
+              </w:rPr>
+              <w:t>42</w:t>
+            </w:r>
+          </w:p>
+        </w:tc>
+        <w:tc>
+          <w:tcPr>
+            <w:tcW w:type="dxa" w:w="2180"/>
+          </w:tcPr>
+          <w:p>
+            <w:r>
+              <w:rPr>
+                <w:sz w:val="13"/>
+              </w:rPr>
+              <w:t>PASS</w:t>
+            </w:r>
+          </w:p>
+        </w:tc>
+        <w:tc>
+          <w:tcPr>
+            <w:tcW w:type="dxa" w:w="2180"/>
+          </w:tcPr>
+          <w:p>
+            <w:r>
+              <w:rPr>
+                <w:sz w:val="13"/>
+              </w:rPr>
+              <w:t>NO_DEFINITION_GAP</w:t>
+            </w:r>
+          </w:p>
+        </w:tc>
+      </w:tr>
+      <w:tr>
+        <w:tc>
+          <w:tcPr>
+            <w:tcW w:type="dxa" w:w="2180"/>
+          </w:tcPr>
+          <w:p>
+            <w:r>
+              <w:rPr>
+                <w:sz w:val="13"/>
+              </w:rPr>
+              <w:t>AIAPI-01</w:t>
+            </w:r>
+          </w:p>
+        </w:tc>
+        <w:tc>
+          <w:tcPr>
+            <w:tcW w:type="dxa" w:w="2180"/>
+          </w:tcPr>
+          <w:p>
+            <w:r>
+              <w:rPr>
+                <w:sz w:val="13"/>
+              </w:rPr>
+              <w:t>17</w:t>
+            </w:r>
+          </w:p>
+        </w:tc>
+        <w:tc>
+          <w:tcPr>
+            <w:tcW w:type="dxa" w:w="2180"/>
+          </w:tcPr>
+          <w:p>
+            <w:r>
+              <w:rPr>
+                <w:sz w:val="13"/>
+              </w:rPr>
+              <w:t>17</w:t>
+            </w:r>
+          </w:p>
+        </w:tc>
+        <w:tc>
+          <w:tcPr>
+            <w:tcW w:type="dxa" w:w="2180"/>
+          </w:tcPr>
+          <w:p>
+            <w:r>
+              <w:rPr>
+                <w:sz w:val="13"/>
+              </w:rPr>
+              <w:t>PASS</w:t>
+            </w:r>
+          </w:p>
+        </w:tc>
+        <w:tc>
+          <w:tcPr>
+            <w:tcW w:type="dxa" w:w="2180"/>
+          </w:tcPr>
+          <w:p>
+            <w:r>
+              <w:rPr>
+                <w:sz w:val="13"/>
+              </w:rPr>
+              <w:t>NO_DEFINITION_GAP</w:t>
+            </w:r>
+          </w:p>
+        </w:tc>
+      </w:tr>
+      <w:tr>
+        <w:tc>
+          <w:tcPr>
+            <w:tcW w:type="dxa" w:w="2180"/>
+          </w:tcPr>
+          <w:p>
+            <w:r>
+              <w:rPr>
+                <w:sz w:val="13"/>
+              </w:rPr>
+              <w:t>SG-02</w:t>
+            </w:r>
+          </w:p>
+        </w:tc>
+        <w:tc>
+          <w:tcPr>
+            <w:tcW w:type="dxa" w:w="2180"/>
+          </w:tcPr>
+          <w:p>
+            <w:r>
+              <w:rPr>
+                <w:sz w:val="13"/>
+              </w:rPr>
+              <w:t>11</w:t>
+            </w:r>
+          </w:p>
+        </w:tc>
+        <w:tc>
+          <w:tcPr>
+            <w:tcW w:type="dxa" w:w="2180"/>
+          </w:tcPr>
+          <w:p>
+            <w:r>
+              <w:rPr>
+                <w:sz w:val="13"/>
+              </w:rPr>
+              <w:t>11</w:t>
+            </w:r>
+          </w:p>
+        </w:tc>
+        <w:tc>
+          <w:tcPr>
+            <w:tcW w:type="dxa" w:w="2180"/>
+          </w:tcPr>
+          <w:p>
+            <w:r>
+              <w:rPr>
+                <w:sz w:val="13"/>
+              </w:rPr>
+              <w:t>PASS</w:t>
+            </w:r>
+          </w:p>
+        </w:tc>
+        <w:tc>
+          <w:tcPr>
+            <w:tcW w:type="dxa" w:w="2180"/>
+          </w:tcPr>
+          <w:p>
+            <w:r>
+              <w:rPr>
+                <w:sz w:val="13"/>
+              </w:rPr>
+              <w:t>RUNTIME_BINDING_VALIDATION</w:t>
+            </w:r>
+          </w:p>
+        </w:tc>
+      </w:tr>
+      <w:tr>
+        <w:tc>
+          <w:tcPr>
+            <w:tcW w:type="dxa" w:w="2180"/>
+          </w:tcPr>
+          <w:p>
+            <w:r>
+              <w:rPr>
+                <w:sz w:val="13"/>
+              </w:rPr>
+              <w:t>ADMIN-STR-01</w:t>
+            </w:r>
+          </w:p>
+        </w:tc>
+        <w:tc>
+          <w:tcPr>
+            <w:tcW w:type="dxa" w:w="2180"/>
+          </w:tcPr>
+          <w:p>
+            <w:r>
+              <w:rPr>
+                <w:sz w:val="13"/>
+              </w:rPr>
+              <w:t>19</w:t>
+            </w:r>
+          </w:p>
+        </w:tc>
+        <w:tc>
+          <w:tcPr>
+            <w:tcW w:type="dxa" w:w="2180"/>
+          </w:tcPr>
+          <w:p>
+            <w:r>
+              <w:rPr>
+                <w:sz w:val="13"/>
+              </w:rPr>
+              <w:t>19</w:t>
+            </w:r>
+          </w:p>
+        </w:tc>
+        <w:tc>
+          <w:tcPr>
+            <w:tcW w:type="dxa" w:w="2180"/>
+          </w:tcPr>
+          <w:p>
+            <w:r>
+              <w:rPr>
+                <w:sz w:val="13"/>
+              </w:rPr>
+              <w:t>PASS</w:t>
+            </w:r>
+          </w:p>
+        </w:tc>
+        <w:tc>
+          <w:tcPr>
+            <w:tcW w:type="dxa" w:w="2180"/>
+          </w:tcPr>
+          <w:p>
+            <w:r>
+              <w:rPr>
+                <w:sz w:val="13"/>
+              </w:rPr>
+              <w:t>RUNTIME_IMPLEMENTATION_BLOCKED; RUNTIME_IMPLEMENTATION_BLOCKED; RUNTIME_IMPLEMENTATION_BLOCKED; RUNTIME_IMPLEMENTATION_BLOCKED; RUNTIME_IMPLEMENTATION_BLOCKED; RUNTIME_IMPLEMENTATION_BLOCKED; PARTIAL_RUNTIME_MATERIALIZATION</w:t>
+            </w:r>
+          </w:p>
+        </w:tc>
+      </w:tr>
+      <w:tr>
+        <w:tc>
+          <w:tcPr>
+            <w:tcW w:type="dxa" w:w="2180"/>
+          </w:tcPr>
+          <w:p>
+            <w:r>
+              <w:rPr>
+                <w:sz w:val="13"/>
+              </w:rPr>
+              <w:t>KB-01</w:t>
+            </w:r>
+          </w:p>
+        </w:tc>
+        <w:tc>
+          <w:tcPr>
+            <w:tcW w:type="dxa" w:w="2180"/>
+          </w:tcPr>
+          <w:p>
+            <w:r>
+              <w:rPr>
+                <w:sz w:val="13"/>
+              </w:rPr>
+              <w:t>27</w:t>
+            </w:r>
+          </w:p>
+        </w:tc>
+        <w:tc>
+          <w:tcPr>
+            <w:tcW w:type="dxa" w:w="2180"/>
+          </w:tcPr>
+          <w:p>
+            <w:r>
+              <w:rPr>
+                <w:sz w:val="13"/>
+              </w:rPr>
+              <w:t>27</w:t>
+            </w:r>
+          </w:p>
+        </w:tc>
+        <w:tc>
+          <w:tcPr>
+            <w:tcW w:type="dxa" w:w="2180"/>
+          </w:tcPr>
+          <w:p>
+            <w:r>
+              <w:rPr>
+                <w:sz w:val="13"/>
+              </w:rPr>
+              <w:t>PASS</w:t>
+            </w:r>
+          </w:p>
+        </w:tc>
+        <w:tc>
+          <w:tcPr>
+            <w:tcW w:type="dxa" w:w="2180"/>
+          </w:tcPr>
+          <w:p>
+            <w:r>
+              <w:rPr>
+                <w:sz w:val="13"/>
+              </w:rPr>
+              <w:t>IMPLEMENTATION_EXECUTION_EVIDENCE</w:t>
+            </w:r>
+          </w:p>
+        </w:tc>
+      </w:tr>
+    </w:tbl>
+    <w:p>
+      <w:r>
+        <w:t>This index records construction definition status only. Human Visual Review / Design Freeze and Production runtime acceptance remain independent gates.</w:t>
+      </w:r>
+    </w:p>
     <w:sectPr>
-      <w:headerReference w:type="default" r:id="rId9"/>
-      <w:footerReference w:type="default" r:id="rId10"/>
-      <w:pgSz w:w="16834" w:h="11909" w:orient="landscape"/>
-      <w:pgMar w:top="605" w:right="648" w:bottom="576" w:left="648" w:header="720" w:footer="720" w:gutter="0"/>
+      <w:pgSz w:w="11909" w:h="16834" w:orient="landscape"/>
+      <w:pgMar w:top="576" w:right="504" w:bottom="576" w:left="504" w:header="720" w:footer="720" w:gutter="0"/>
       <w:cols w:space="720"/>
       <w:docGrid w:linePitch="360"/>
     </w:sectPr>

</xml_diff>

<commit_message>
docs(acpos): materialize concrete review criteria and content completeness gate
</commit_message>
<xml_diff>
--- a/00_INDEX_ACPOS_Mother_Compliant_Basic_Design_Master.docx
+++ b/00_INDEX_ACPOS_Mother_Compliant_Basic_Design_Master.docx
@@ -7356,9 +7356,471 @@
         <w:t>This index records construction definition status only. Human Visual Review / Design Freeze and Production runtime acceptance remain independent gates.</w:t>
       </w:r>
     </w:p>
+    <w:p>
+      <w:pPr>
+        <w:sectPr>
+          <w:pgSz w:w="11909" w:h="16834" w:orient="landscape"/>
+          <w:pgMar w:top="576" w:right="504" w:bottom="576" w:left="504" w:header="720" w:footer="720" w:gutter="0"/>
+          <w:cols w:space="720"/>
+          <w:docGrid w:linePitch="360"/>
+        </w:sectPr>
+      </w:pPr>
+    </w:p>
+    <w:p>
+      <w:pPr>
+        <w:pStyle w:val="Heading1"/>
+      </w:pPr>
+      <w:r>
+        <w:t>Concrete Business Content Closure Index</w:t>
+      </w:r>
+    </w:p>
+    <w:p>
+      <w:r>
+        <w:rPr>
+          <w:b/>
+        </w:rPr>
+        <w:t xml:space="preserve">[ACPOS-20260921-CONCRETE-BUSINESS-CONTENT-CLOSURE-V1] </w:t>
+      </w:r>
+      <w:r>
+        <w:t>這一段是完整來源掃描後補入的 Concrete Business Content Authority。既有來源已明確的內容沿用；原來源只有抽象 Criteria/Dimension 容器而缺實際明細者，以下項目標示為本次新 Authority。</w:t>
+      </w:r>
+    </w:p>
+    <w:tbl>
+      <w:tblPr>
+        <w:tblStyle w:val="TableGrid"/>
+        <w:tblW w:type="auto" w:w="0"/>
+        <w:tblLook w:firstColumn="1" w:firstRow="1" w:lastColumn="0" w:lastRow="0" w:noHBand="0" w:noVBand="1" w:val="04A0"/>
+      </w:tblPr>
+      <w:tblGrid>
+        <w:gridCol w:w="5275"/>
+        <w:gridCol w:w="5275"/>
+        <w:gridCol w:w="5275"/>
+      </w:tblGrid>
+      <w:tr>
+        <w:trPr>
+          <w:tblHeader w:val="true"/>
+        </w:trPr>
+        <w:tc>
+          <w:tcPr>
+            <w:tcW w:type="dxa" w:w="5275"/>
+            <w:shd w:fill="EDE9FE"/>
+          </w:tcPr>
+          <w:p>
+            <w:r>
+              <w:rPr>
+                <w:sz w:val="12"/>
+              </w:rPr>
+              <w:t>Page</w:t>
+            </w:r>
+          </w:p>
+        </w:tc>
+        <w:tc>
+          <w:tcPr>
+            <w:tcW w:type="dxa" w:w="5275"/>
+            <w:shd w:fill="EDE9FE"/>
+          </w:tcPr>
+          <w:p>
+            <w:r>
+              <w:rPr>
+                <w:sz w:val="12"/>
+              </w:rPr>
+              <w:t>Previous defect</w:t>
+            </w:r>
+          </w:p>
+        </w:tc>
+        <w:tc>
+          <w:tcPr>
+            <w:tcW w:type="dxa" w:w="5275"/>
+            <w:shd w:fill="EDE9FE"/>
+          </w:tcPr>
+          <w:p>
+            <w:r>
+              <w:rPr>
+                <w:sz w:val="12"/>
+              </w:rPr>
+              <w:t>Closure</w:t>
+            </w:r>
+          </w:p>
+        </w:tc>
+      </w:tr>
+      <w:tr>
+        <w:tc>
+          <w:tcPr>
+            <w:tcW w:type="dxa" w:w="5275"/>
+          </w:tcPr>
+          <w:p>
+            <w:r>
+              <w:rPr>
+                <w:sz w:val="12"/>
+              </w:rPr>
+              <w:t>CORE-01</w:t>
+            </w:r>
+          </w:p>
+        </w:tc>
+        <w:tc>
+          <w:tcPr>
+            <w:tcW w:type="dxa" w:w="5275"/>
+          </w:tcPr>
+          <w:p>
+            <w:r>
+              <w:rPr>
+                <w:sz w:val="12"/>
+              </w:rPr>
+              <w:t>Approved CORE Criteria referenced, no concrete dimensions</w:t>
+            </w:r>
+          </w:p>
+        </w:tc>
+        <w:tc>
+          <w:tcPr>
+            <w:tcW w:type="dxa" w:w="5275"/>
+          </w:tcPr>
+          <w:p>
+            <w:r>
+              <w:rPr>
+                <w:sz w:val="12"/>
+              </w:rPr>
+              <w:t>8-dimension CORE baseline profile added + page row-render requirement</w:t>
+            </w:r>
+          </w:p>
+        </w:tc>
+      </w:tr>
+      <w:tr>
+        <w:tc>
+          <w:tcPr>
+            <w:tcW w:type="dxa" w:w="5275"/>
+          </w:tcPr>
+          <w:p>
+            <w:r>
+              <w:rPr>
+                <w:sz w:val="12"/>
+              </w:rPr>
+              <w:t>ASSET-01</w:t>
+            </w:r>
+          </w:p>
+        </w:tc>
+        <w:tc>
+          <w:tcPr>
+            <w:tcW w:type="dxa" w:w="5275"/>
+          </w:tcPr>
+          <w:p>
+            <w:r>
+              <w:rPr>
+                <w:sz w:val="12"/>
+              </w:rPr>
+              <w:t>Scorecard fields existed, no concrete dimension catalog</w:t>
+            </w:r>
+          </w:p>
+        </w:tc>
+        <w:tc>
+          <w:tcPr>
+            <w:tcW w:type="dxa" w:w="5275"/>
+          </w:tcPr>
+          <w:p>
+            <w:r>
+              <w:rPr>
+                <w:sz w:val="12"/>
+              </w:rPr>
+              <w:t>9-dimension IMAGE + 8-dimension AUDIO profiles added</w:t>
+            </w:r>
+          </w:p>
+        </w:tc>
+      </w:tr>
+      <w:tr>
+        <w:tc>
+          <w:tcPr>
+            <w:tcW w:type="dxa" w:w="5275"/>
+          </w:tcPr>
+          <w:p>
+            <w:r>
+              <w:rPr>
+                <w:sz w:val="12"/>
+              </w:rPr>
+              <w:t>VIDEO-01</w:t>
+            </w:r>
+          </w:p>
+        </w:tc>
+        <w:tc>
+          <w:tcPr>
+            <w:tcW w:type="dxa" w:w="5275"/>
+          </w:tcPr>
+          <w:p>
+            <w:r>
+              <w:rPr>
+                <w:sz w:val="12"/>
+              </w:rPr>
+              <w:t>9 dimensions existed but no governed weights/profile</w:t>
+            </w:r>
+          </w:p>
+        </w:tc>
+        <w:tc>
+          <w:tcPr>
+            <w:tcW w:type="dxa" w:w="5275"/>
+          </w:tcPr>
+          <w:p>
+            <w:r>
+              <w:rPr>
+                <w:sz w:val="12"/>
+              </w:rPr>
+              <w:t>Existing 9 UIDs preserved; weights + SG-02 mapping added</w:t>
+            </w:r>
+          </w:p>
+        </w:tc>
+      </w:tr>
+      <w:tr>
+        <w:tc>
+          <w:tcPr>
+            <w:tcW w:type="dxa" w:w="5275"/>
+          </w:tcPr>
+          <w:p>
+            <w:r>
+              <w:rPr>
+                <w:sz w:val="12"/>
+              </w:rPr>
+              <w:t>EDIT-01</w:t>
+            </w:r>
+          </w:p>
+        </w:tc>
+        <w:tc>
+          <w:tcPr>
+            <w:tcW w:type="dxa" w:w="5275"/>
+          </w:tcPr>
+          <w:p>
+            <w:r>
+              <w:rPr>
+                <w:sz w:val="12"/>
+              </w:rPr>
+              <w:t>dimension_scores existed, no concrete stage dimension names</w:t>
+            </w:r>
+          </w:p>
+        </w:tc>
+        <w:tc>
+          <w:tcPr>
+            <w:tcW w:type="dxa" w:w="5275"/>
+          </w:tcPr>
+          <w:p>
+            <w:r>
+              <w:rPr>
+                <w:sz w:val="12"/>
+              </w:rPr>
+              <w:t>12-dimension EDIT profile + stage applicability added</w:t>
+            </w:r>
+          </w:p>
+        </w:tc>
+      </w:tr>
+      <w:tr>
+        <w:tc>
+          <w:tcPr>
+            <w:tcW w:type="dxa" w:w="5275"/>
+          </w:tcPr>
+          <w:p>
+            <w:r>
+              <w:rPr>
+                <w:sz w:val="12"/>
+              </w:rPr>
+              <w:t>QA-01</w:t>
+            </w:r>
+          </w:p>
+        </w:tc>
+        <w:tc>
+          <w:tcPr>
+            <w:tcW w:type="dxa" w:w="5275"/>
+          </w:tcPr>
+          <w:p>
+            <w:r>
+              <w:rPr>
+                <w:sz w:val="12"/>
+              </w:rPr>
+              <w:t>Generated dimension table existed, but actual review items absent</w:t>
+            </w:r>
+          </w:p>
+        </w:tc>
+        <w:tc>
+          <w:tcPr>
+            <w:tcW w:type="dxa" w:w="5275"/>
+          </w:tcPr>
+          <w:p>
+            <w:r>
+              <w:rPr>
+                <w:sz w:val="12"/>
+              </w:rPr>
+              <w:t>17 concrete final-output review items + exact scorecard display contract added</w:t>
+            </w:r>
+          </w:p>
+        </w:tc>
+      </w:tr>
+      <w:tr>
+        <w:tc>
+          <w:tcPr>
+            <w:tcW w:type="dxa" w:w="5275"/>
+          </w:tcPr>
+          <w:p>
+            <w:r>
+              <w:rPr>
+                <w:sz w:val="12"/>
+              </w:rPr>
+              <w:t>SG-02</w:t>
+            </w:r>
+          </w:p>
+        </w:tc>
+        <w:tc>
+          <w:tcPr>
+            <w:tcW w:type="dxa" w:w="5275"/>
+          </w:tcPr>
+          <w:p>
+            <w:r>
+              <w:rPr>
+                <w:sz w:val="12"/>
+              </w:rPr>
+              <w:t>Dimension/Criteria containers empty; lifecycle lacked DRAFT→REVIEW action</w:t>
+            </w:r>
+          </w:p>
+        </w:tc>
+        <w:tc>
+          <w:tcPr>
+            <w:tcW w:type="dxa" w:w="5275"/>
+          </w:tcPr>
+          <w:p>
+            <w:r>
+              <w:rPr>
+                <w:sz w:val="12"/>
+              </w:rPr>
+              <w:t>6 baseline profiles + dimension/check/category catalogs + Submit Review authority; denominator 12</w:t>
+            </w:r>
+          </w:p>
+        </w:tc>
+      </w:tr>
+    </w:tbl>
+    <w:tbl>
+      <w:tblPr>
+        <w:tblStyle w:val="TableGrid"/>
+        <w:tblW w:type="auto" w:w="0"/>
+        <w:tblLook w:firstColumn="1" w:firstRow="1" w:lastColumn="0" w:lastRow="0" w:noHBand="0" w:noVBand="1" w:val="04A0"/>
+      </w:tblPr>
+      <w:tblGrid>
+        <w:gridCol w:w="7913"/>
+        <w:gridCol w:w="7913"/>
+      </w:tblGrid>
+      <w:tr>
+        <w:trPr>
+          <w:tblHeader w:val="true"/>
+        </w:trPr>
+        <w:tc>
+          <w:tcPr>
+            <w:tcW w:type="dxa" w:w="7913"/>
+            <w:shd w:fill="EDE9FE"/>
+          </w:tcPr>
+          <w:p>
+            <w:r>
+              <w:rPr>
+                <w:sz w:val="12"/>
+              </w:rPr>
+              <w:t>Other pages audited</w:t>
+            </w:r>
+          </w:p>
+        </w:tc>
+        <w:tc>
+          <w:tcPr>
+            <w:tcW w:type="dxa" w:w="7913"/>
+            <w:shd w:fill="EDE9FE"/>
+          </w:tcPr>
+          <w:p>
+            <w:r>
+              <w:rPr>
+                <w:sz w:val="12"/>
+              </w:rPr>
+              <w:t>Result</w:t>
+            </w:r>
+          </w:p>
+        </w:tc>
+      </w:tr>
+      <w:tr>
+        <w:tc>
+          <w:tcPr>
+            <w:tcW w:type="dxa" w:w="7913"/>
+          </w:tcPr>
+          <w:p>
+            <w:r>
+              <w:rPr>
+                <w:sz w:val="12"/>
+              </w:rPr>
+              <w:t>WB-01 / DB-01 / INFO-01 / IAM-01</w:t>
+            </w:r>
+          </w:p>
+        </w:tc>
+        <w:tc>
+          <w:tcPr>
+            <w:tcW w:type="dxa" w:w="7913"/>
+          </w:tcPr>
+          <w:p>
+            <w:r>
+              <w:rPr>
+                <w:sz w:val="12"/>
+              </w:rPr>
+              <w:t>No same defect: fixed schemas/sections/entities are concrete; runtime records are intentionally dynamic.</w:t>
+            </w:r>
+          </w:p>
+        </w:tc>
+      </w:tr>
+      <w:tr>
+        <w:tc>
+          <w:tcPr>
+            <w:tcW w:type="dxa" w:w="7913"/>
+          </w:tcPr>
+          <w:p>
+            <w:r>
+              <w:rPr>
+                <w:sz w:val="12"/>
+              </w:rPr>
+              <w:t>DEV-01 / SOC-01 / ERP-01 / AIAPI-01</w:t>
+            </w:r>
+          </w:p>
+        </w:tc>
+        <w:tc>
+          <w:tcPr>
+            <w:tcW w:type="dxa" w:w="7913"/>
+          </w:tcPr>
+          <w:p>
+            <w:r>
+              <w:rPr>
+                <w:sz w:val="12"/>
+              </w:rPr>
+              <w:t>No same defect: business entities, stages/contracts/fields are concrete; values/providers/amounts remain real-data-only.</w:t>
+            </w:r>
+          </w:p>
+        </w:tc>
+      </w:tr>
+      <w:tr>
+        <w:tc>
+          <w:tcPr>
+            <w:tcW w:type="dxa" w:w="7913"/>
+          </w:tcPr>
+          <w:p>
+            <w:r>
+              <w:rPr>
+                <w:sz w:val="12"/>
+              </w:rPr>
+              <w:t>STR-01 / Admin STR-01 / KB-01 / SYS-01</w:t>
+            </w:r>
+          </w:p>
+        </w:tc>
+        <w:tc>
+          <w:tcPr>
+            <w:tcW w:type="dxa" w:w="7913"/>
+          </w:tcPr>
+          <w:p>
+            <w:r>
+              <w:rPr>
+                <w:sz w:val="12"/>
+              </w:rPr>
+              <w:t>No same defect: workflow/entity/review/source contracts are concrete; dynamic facts/candidates/sources must not be seeded.</w:t>
+            </w:r>
+          </w:p>
+        </w:tc>
+      </w:tr>
+    </w:tbl>
     <w:sectPr>
-      <w:pgSz w:w="11909" w:h="16834" w:orient="landscape"/>
-      <w:pgMar w:top="576" w:right="504" w:bottom="576" w:left="504" w:header="720" w:footer="720" w:gutter="0"/>
+      <w:pgSz w:w="16834" w:h="11909" w:orient="landscape"/>
+      <w:pgMar w:top="547" w:right="504" w:bottom="547" w:left="504" w:header="720" w:footer="720" w:gutter="0"/>
       <w:cols w:space="720"/>
       <w:docGrid w:linePitch="360"/>
     </w:sectPr>

</xml_diff>

<commit_message>
docs(acpos): reconcile concrete criteria with exact SG02 authority
</commit_message>
<xml_diff>
--- a/00_INDEX_ACPOS_Mother_Compliant_Basic_Design_Master.docx
+++ b/00_INDEX_ACPOS_Mother_Compliant_Basic_Design_Master.docx
@@ -7169,10 +7169,7 @@
           </w:tcPr>
           <w:p>
             <w:r>
-              <w:rPr>
-                <w:sz w:val="13"/>
-              </w:rPr>
-              <w:t>11</w:t>
+              <w:t>12</w:t>
             </w:r>
           </w:p>
         </w:tc>
@@ -7182,10 +7179,7 @@
           </w:tcPr>
           <w:p>
             <w:r>
-              <w:rPr>
-                <w:sz w:val="13"/>
-              </w:rPr>
-              <w:t>11</w:t>
+              <w:t>12</w:t>
             </w:r>
           </w:p>
         </w:tc>

</xml_diff>

<commit_message>
docs(acpos): close batch-01 foundation design gaps
</commit_message>
<xml_diff>
--- a/00_INDEX_ACPOS_Mother_Compliant_Basic_Design_Master.docx
+++ b/00_INDEX_ACPOS_Mother_Compliant_Basic_Design_Master.docx
@@ -30,7 +30,7 @@
           <w:color w:val="596078"/>
           <w:sz w:val="16"/>
         </w:rPr>
-        <w:t>GitHub new @ 165c6440cb53 · Current Authority 基準 + 使用者指定更新／補充 · DESIGN_FROZEN = FALSE</w:t>
+        <w:t>Current HEAD：MUST be resolved fresh from GitHub branch 0921acpos at audit/execution time. Historical SHA references are evidence only and MUST NOT be treated as Current Truth.</w:t>
       </w:r>
     </w:p>
     <w:p>
@@ -198,7 +198,7 @@
                 <w:color w:val="171A2B"/>
                 <w:sz w:val="13"/>
               </w:rPr>
-              <w:t>165c6440cb53b1b45ec96905241fb4d56dc3b867</w:t>
+              <w:t>Current HEAD：MUST be resolved fresh from GitHub branch 0921acpos at audit/execution time. Historical SHA references are evidence only and MUST NOT be treated as Current Truth.</w:t>
             </w:r>
           </w:p>
         </w:tc>
@@ -7812,9 +7812,250 @@
         </w:tc>
       </w:tr>
     </w:tbl>
+    <w:p>
+      <w:pPr>
+        <w:sectPr>
+          <w:pgSz w:w="16834" w:h="11909" w:orient="landscape"/>
+          <w:pgMar w:top="547" w:right="504" w:bottom="547" w:left="504" w:header="720" w:footer="720" w:gutter="0"/>
+          <w:cols w:space="720"/>
+          <w:docGrid w:linePitch="360"/>
+        </w:sectPr>
+      </w:pPr>
+    </w:p>
+    <w:p>
+      <w:pPr>
+        <w:pStyle w:val="Heading1"/>
+      </w:pPr>
+      <w:r>
+        <w:t>Current Package Identity / Dynamic Denominator Closure</w:t>
+      </w:r>
+    </w:p>
+    <w:p>
+      <w:r>
+        <w:rPr>
+          <w:b/>
+        </w:rPr>
+        <w:t xml:space="preserve">[ACPOS-20260921-BATCH-01-FOUNDATION-CLOSURE-V1] </w:t>
+      </w:r>
+      <w:r>
+        <w:t>本節為 0921acpos Current Word package 的正式缺口閉合內容。只定義 Basic Design / authority contract；若缺 Runtime / Production evidence，狀態仍必須維持 NOT_EXECUTED / IMPLEMENTATION_REQUIRED，不得因文件定義完成而宣告 Runtime 完成。</w:t>
+      </w:r>
+    </w:p>
+    <w:tbl>
+      <w:tblPr>
+        <w:tblStyle w:val="TableGrid"/>
+        <w:tblW w:type="auto" w:w="0"/>
+        <w:tblLook w:firstColumn="1" w:firstRow="1" w:lastColumn="0" w:lastRow="0" w:noHBand="0" w:noVBand="1" w:val="04A0"/>
+      </w:tblPr>
+      <w:tblGrid>
+        <w:gridCol w:w="5349"/>
+        <w:gridCol w:w="5349"/>
+      </w:tblGrid>
+      <w:tr>
+        <w:trPr>
+          <w:tblHeader w:val="true"/>
+        </w:trPr>
+        <w:tc>
+          <w:tcPr>
+            <w:tcW w:type="dxa" w:w="5349"/>
+            <w:shd w:fill="EDE9FE"/>
+          </w:tcPr>
+          <w:p>
+            <w:r>
+              <w:rPr>
+                <w:sz w:val="12"/>
+              </w:rPr>
+              <w:t>Item</w:t>
+            </w:r>
+          </w:p>
+        </w:tc>
+        <w:tc>
+          <w:tcPr>
+            <w:tcW w:type="dxa" w:w="5349"/>
+            <w:shd w:fill="EDE9FE"/>
+          </w:tcPr>
+          <w:p>
+            <w:r>
+              <w:rPr>
+                <w:sz w:val="12"/>
+              </w:rPr>
+              <w:t>Current rule</w:t>
+            </w:r>
+          </w:p>
+        </w:tc>
+      </w:tr>
+      <w:tr>
+        <w:tc>
+          <w:tcPr>
+            <w:tcW w:type="dxa" w:w="5349"/>
+          </w:tcPr>
+          <w:p>
+            <w:r>
+              <w:rPr>
+                <w:sz w:val="12"/>
+              </w:rPr>
+              <w:t>Branch</w:t>
+            </w:r>
+          </w:p>
+        </w:tc>
+        <w:tc>
+          <w:tcPr>
+            <w:tcW w:type="dxa" w:w="5349"/>
+          </w:tcPr>
+          <w:p>
+            <w:r>
+              <w:rPr>
+                <w:sz w:val="12"/>
+              </w:rPr>
+              <w:t>0921acpos</w:t>
+            </w:r>
+          </w:p>
+        </w:tc>
+      </w:tr>
+      <w:tr>
+        <w:tc>
+          <w:tcPr>
+            <w:tcW w:type="dxa" w:w="5349"/>
+          </w:tcPr>
+          <w:p>
+            <w:r>
+              <w:rPr>
+                <w:sz w:val="12"/>
+              </w:rPr>
+              <w:t>Physical package denominator</w:t>
+            </w:r>
+          </w:p>
+        </w:tc>
+        <w:tc>
+          <w:tcPr>
+            <w:tcW w:type="dxa" w:w="5349"/>
+          </w:tcPr>
+          <w:p>
+            <w:r>
+              <w:rPr>
+                <w:sz w:val="12"/>
+              </w:rPr>
+              <w:t>31 DOCX: 1 Index + 9 System Normative + 18 Page Design + Login + System Logic + Global Shell</w:t>
+            </w:r>
+          </w:p>
+        </w:tc>
+      </w:tr>
+      <w:tr>
+        <w:tc>
+          <w:tcPr>
+            <w:tcW w:type="dxa" w:w="5349"/>
+          </w:tcPr>
+          <w:p>
+            <w:r>
+              <w:rPr>
+                <w:sz w:val="12"/>
+              </w:rPr>
+              <w:t>HEAD identity</w:t>
+            </w:r>
+          </w:p>
+        </w:tc>
+        <w:tc>
+          <w:tcPr>
+            <w:tcW w:type="dxa" w:w="5349"/>
+          </w:tcPr>
+          <w:p>
+            <w:r>
+              <w:rPr>
+                <w:sz w:val="12"/>
+              </w:rPr>
+              <w:t>Dynamic. Resolve fresh from GitHub before audit, batch execution, validation and completion declaration; do not hard-code a historical SHA as Current Truth.</w:t>
+            </w:r>
+          </w:p>
+        </w:tc>
+      </w:tr>
+      <w:tr>
+        <w:tc>
+          <w:tcPr>
+            <w:tcW w:type="dxa" w:w="5349"/>
+          </w:tcPr>
+          <w:p>
+            <w:r>
+              <w:rPr>
+                <w:sz w:val="12"/>
+              </w:rPr>
+              <w:t>File applicability</w:t>
+            </w:r>
+          </w:p>
+        </w:tc>
+        <w:tc>
+          <w:tcPr>
+            <w:tcW w:type="dxa" w:w="5349"/>
+          </w:tcPr>
+          <w:p>
+            <w:r>
+              <w:rPr>
+                <w:sz w:val="12"/>
+              </w:rPr>
+              <w:t>Every physical DOCX in the package is in denominator unless an explicit Current Authority exclusion exists.</w:t>
+            </w:r>
+          </w:p>
+        </w:tc>
+      </w:tr>
+      <w:tr>
+        <w:tc>
+          <w:tcPr>
+            <w:tcW w:type="dxa" w:w="5349"/>
+          </w:tcPr>
+          <w:p>
+            <w:r>
+              <w:rPr>
+                <w:sz w:val="12"/>
+              </w:rPr>
+              <w:t>Evidence</w:t>
+            </w:r>
+          </w:p>
+        </w:tc>
+        <w:tc>
+          <w:tcPr>
+            <w:tcW w:type="dxa" w:w="5349"/>
+          </w:tcPr>
+          <w:p>
+            <w:r>
+              <w:rPr>
+                <w:sz w:val="12"/>
+              </w:rPr>
+              <w:t>Current branch root scan + exact Git blob SHA for each target file + fresh batch validation run.</w:t>
+            </w:r>
+          </w:p>
+        </w:tc>
+      </w:tr>
+      <w:tr>
+        <w:tc>
+          <w:tcPr>
+            <w:tcW w:type="dxa" w:w="5349"/>
+          </w:tcPr>
+          <w:p>
+            <w:r>
+              <w:rPr>
+                <w:sz w:val="12"/>
+              </w:rPr>
+              <w:t>Stale metadata rule</w:t>
+            </w:r>
+          </w:p>
+        </w:tc>
+        <w:tc>
+          <w:tcPr>
+            <w:tcW w:type="dxa" w:w="5349"/>
+          </w:tcPr>
+          <w:p>
+            <w:r>
+              <w:rPr>
+                <w:sz w:val="12"/>
+              </w:rPr>
+              <w:t>Any embedded branch/SHA/count that conflicts with the fresh physical scan is historical evidence only, not Current package authority.</w:t>
+            </w:r>
+          </w:p>
+        </w:tc>
+      </w:tr>
+    </w:tbl>
     <w:sectPr>
-      <w:pgSz w:w="16834" w:h="11909" w:orient="landscape"/>
-      <w:pgMar w:top="547" w:right="504" w:bottom="547" w:left="504" w:header="720" w:footer="720" w:gutter="0"/>
+      <w:pgSz w:w="11909" w:h="16834" w:orient="landscape"/>
+      <w:pgMar w:top="605" w:right="605" w:bottom="605" w:left="605" w:header="720" w:footer="720" w:gutter="0"/>
       <w:cols w:space="720"/>
       <w:docGrid w:linePitch="360"/>
     </w:sectPr>

</xml_diff>

<commit_message>
fix(acpos): remove Word stale truth pollution and close strategy design dispositions
</commit_message>
<xml_diff>
--- a/00_INDEX_ACPOS_Mother_Compliant_Basic_Design_Master.docx
+++ b/00_INDEX_ACPOS_Mother_Compliant_Basic_Design_Master.docx
@@ -55,7 +55,7 @@
           <w:color w:val="171A2B"/>
           <w:sz w:val="16"/>
         </w:rPr>
-        <w:t>本包共 20 份 Basic Design：18 個 GitHub Current Pages + Login/Identity Entry + 全站 System Logic；另有本總目錄，共 21 份 Word。每一份頁面文件均獨立完成 Mother S076–S083 相容的 27 項 Blueprint artifact denominator，避免把所有頁面混成一份大文件。</w:t>
+        <w:t>本包共 20 份 Basic Design：18 個 GitHub Current Pages + Login/Identity Entry + 全站 System Logic；另有本總目錄，共 31 份 Word。每一份頁面文件均獨立完成 Mother S076–S083 相容的 27 項 Blueprint artifact denominator，避免把所有頁面混成一份大文件。</w:t>
       </w:r>
     </w:p>
     <w:tbl>
@@ -154,7 +154,7 @@
                 <w:color w:val="171A2B"/>
                 <w:sz w:val="13"/>
               </w:rPr>
-              <w:t>new</w:t>
+              <w:t>0921acpos</w:t>
             </w:r>
           </w:p>
         </w:tc>
@@ -198,7 +198,7 @@
                 <w:color w:val="171A2B"/>
                 <w:sz w:val="13"/>
               </w:rPr>
-              <w:t>Current HEAD：MUST be resolved fresh from GitHub branch 0921acpos at audit/execution time. Historical SHA references are evidence only and MUST NOT be treated as Current Truth.</w:t>
+              <w:t>RESOLVE_FRESH_AT_AUDIT_TIME</w:t>
             </w:r>
           </w:p>
         </w:tc>
@@ -3222,7 +3222,7 @@
                 <w:color w:val="171A2B"/>
                 <w:sz w:val="11"/>
               </w:rPr>
-              <w:t>01_HOME/01_WB-01_公司首頁_儀表板_Mother_Compliant_Basic_Design.docx</w:t>
+              <w:t>ACPOS_WB-01_MOTHER_BASIC_DESIGN_TECH_PURPLE_v1.0.docx</w:t>
             </w:r>
           </w:p>
         </w:tc>
@@ -3371,7 +3371,7 @@
                 <w:color w:val="171A2B"/>
                 <w:sz w:val="11"/>
               </w:rPr>
-              <w:t>02_FRONT/02_CORE-01_核心 AI 工作區_Mother_Compliant_Basic_Design.docx</w:t>
+              <w:t>ACPOS_CORE-01_MOTHER_BASIC_DESIGN_TECH_PURPLE_v1.0.docx</w:t>
             </w:r>
           </w:p>
         </w:tc>
@@ -3513,7 +3513,7 @@
                 <w:color w:val="171A2B"/>
                 <w:sz w:val="11"/>
               </w:rPr>
-              <w:t>02_FRONT/03_ASSET-01_素材生產工作區_Mother_Compliant_Basic_Design.docx</w:t>
+              <w:t>ACPOS_ASSET-01_MOTHER_BASIC_DESIGN_TECH_PURPLE_v1.0.docx</w:t>
             </w:r>
           </w:p>
         </w:tc>
@@ -3662,7 +3662,7 @@
                 <w:color w:val="171A2B"/>
                 <w:sz w:val="11"/>
               </w:rPr>
-              <w:t>02_FRONT/04_VIDEO-01_影片生成工作區_Mother_Compliant_Basic_Design.docx</w:t>
+              <w:t>ACPOS_VIDEO-01_MOTHER_BASIC_DESIGN_TECH_PURPLE_v1.0.docx</w:t>
             </w:r>
           </w:p>
         </w:tc>
@@ -3804,7 +3804,7 @@
                 <w:color w:val="171A2B"/>
                 <w:sz w:val="11"/>
               </w:rPr>
-              <w:t>02_FRONT/05_EDIT-01_整合後製剪輯工作台_Mother_Compliant_Basic_Design.docx</w:t>
+              <w:t>ACPOS_EDIT-01_MOTHER_BASIC_DESIGN_TECH_PURPLE_v1.0.docx</w:t>
             </w:r>
           </w:p>
         </w:tc>
@@ -3953,7 +3953,7 @@
                 <w:color w:val="171A2B"/>
                 <w:sz w:val="11"/>
               </w:rPr>
-              <w:t>02_FRONT/06_QA-01_QA 審查工作區_Mother_Compliant_Basic_Design.docx</w:t>
+              <w:t>ACPOS_QA-01_MOTHER_BASIC_DESIGN_TECH_PURPLE_v1.0.docx</w:t>
             </w:r>
           </w:p>
         </w:tc>
@@ -4095,7 +4095,7 @@
                 <w:color w:val="171A2B"/>
                 <w:sz w:val="11"/>
               </w:rPr>
-              <w:t>02_FRONT/07_DB-01_資料庫_資料血緣工作區_Mother_Compliant_Basic_Design.docx</w:t>
+              <w:t>ACPOS_DB-01_MOTHER_BASIC_DESIGN_TECH_PURPLE_v1.0.docx</w:t>
             </w:r>
           </w:p>
         </w:tc>
@@ -4244,7 +4244,7 @@
                 <w:color w:val="171A2B"/>
                 <w:sz w:val="11"/>
               </w:rPr>
-              <w:t>02_FRONT/08_STR-01_戰略中心工作區_Mother_Compliant_Basic_Design.docx</w:t>
+              <w:t>ACPOS_STR-01_WORKSPACE_MOTHER_BASIC_DESIGN_TECH_PURPLE_v1.0.docx</w:t>
             </w:r>
           </w:p>
         </w:tc>
@@ -4386,7 +4386,7 @@
                 <w:color w:val="171A2B"/>
                 <w:sz w:val="11"/>
               </w:rPr>
-              <w:t>02_FRONT/09_INFO-01_最新資訊工作區_Mother_Compliant_Basic_Design.docx</w:t>
+              <w:t>ACPOS_INFO-01_MOTHER_BASIC_DESIGN_TECH_PURPLE_v1.0.docx</w:t>
             </w:r>
           </w:p>
         </w:tc>
@@ -4535,7 +4535,7 @@
                 <w:color w:val="171A2B"/>
                 <w:sz w:val="11"/>
               </w:rPr>
-              <w:t>03_ADMIN/10_SYS-01_系統維護_系統生命週期_Mother_Compliant_Basic_Design.docx</w:t>
+              <w:t>ACPOS_SYS-01_系統維護與生命週期工作區_Mother_Basic_Design_OPTIMIZED.docx</w:t>
             </w:r>
           </w:p>
         </w:tc>
@@ -4677,7 +4677,7 @@
                 <w:color w:val="171A2B"/>
                 <w:sz w:val="11"/>
               </w:rPr>
-              <w:t>03_ADMIN/11_IAM-01_帳戶與權限_Mother_Compliant_Basic_Design.docx</w:t>
+              <w:t>ACPOS_IAM-01_帳戶與權限_Mother_Basic_Design_OPTIMIZED.docx</w:t>
             </w:r>
           </w:p>
         </w:tc>
@@ -4826,7 +4826,7 @@
                 <w:color w:val="171A2B"/>
                 <w:sz w:val="11"/>
               </w:rPr>
-              <w:t>03_ADMIN/12_DEV-01_企業開發與商機自動化_Mother_Compliant_Basic_Design.docx</w:t>
+              <w:t>ACPOS_DEV-01_企業自動開發系統_Mother_Basic_Design_OPTIMIZED.docx</w:t>
             </w:r>
           </w:p>
         </w:tc>
@@ -4968,7 +4968,7 @@
                 <w:color w:val="171A2B"/>
                 <w:sz w:val="11"/>
               </w:rPr>
-              <w:t>03_ADMIN/13_SOC-01_自動廣告_公開市場商機與社群發布_Mother_Compliant_Basic_Design.docx</w:t>
+              <w:t>ACPOS_SOC-01_社群發布_Mother_Basic_Design_OPTIMIZED.docx</w:t>
             </w:r>
           </w:p>
         </w:tc>
@@ -5117,7 +5117,7 @@
                 <w:color w:val="171A2B"/>
                 <w:sz w:val="11"/>
               </w:rPr>
-              <w:t>03_ADMIN/14_ERP-01_ERP_財務_Mother_Compliant_Basic_Design.docx</w:t>
+              <w:t>ACPOS_ERP-01_ERP與財務_Mother_Basic_Design_OPTIMIZED.docx</w:t>
             </w:r>
           </w:p>
         </w:tc>
@@ -5259,7 +5259,7 @@
                 <w:color w:val="171A2B"/>
                 <w:sz w:val="11"/>
               </w:rPr>
-              <w:t>03_ADMIN/15_AIAPI-01_AI API 管理_Mother_Compliant_Basic_Design.docx</w:t>
+              <w:t>ACPOS_AIAPI-01_AI_API管理_Mother_Basic_Design_OPTIMIZED.docx</w:t>
             </w:r>
           </w:p>
         </w:tc>
@@ -5408,7 +5408,7 @@
                 <w:color w:val="171A2B"/>
                 <w:sz w:val="11"/>
               </w:rPr>
-              <w:t>03_ADMIN/16_SG-02_QA 審查項目_品質標準治理_Mother_Compliant_Basic_Design.docx</w:t>
+              <w:t>ACPOS_SG-02_QA審查項目名單_Mother_Basic_Design_OPTIMIZED.docx</w:t>
             </w:r>
           </w:p>
         </w:tc>
@@ -5550,7 +5550,7 @@
                 <w:color w:val="171A2B"/>
                 <w:sz w:val="11"/>
               </w:rPr>
-              <w:t>03_ADMIN/17_ADMIN-STR-01_戰略中心後台_Mother_Compliant_Basic_Design.docx</w:t>
+              <w:t>ACPOS_admin_STR-01_戰略中心後台_Mother_Basic_Design_OPTIMIZED.docx</w:t>
             </w:r>
           </w:p>
         </w:tc>
@@ -5699,7 +5699,7 @@
                 <w:color w:val="171A2B"/>
                 <w:sz w:val="11"/>
               </w:rPr>
-              <w:t>03_ADMIN/18_KB-01_知識庫與 Experience 中心_Mother_Compliant_Basic_Design.docx</w:t>
+              <w:t>ACPOS_KB-01_知識庫_Mother_Basic_Design_OPTIMIZED.docx</w:t>
             </w:r>
           </w:p>
         </w:tc>
@@ -5841,7 +5841,7 @@
                 <w:color w:val="171A2B"/>
                 <w:sz w:val="11"/>
               </w:rPr>
-              <w:t>04_LOGIN/19_LOGIN_登入_身份入口_Mother_Compliant_Basic_Design.docx</w:t>
+              <w:t>ACPOS_LOGIN_IDENTITY_ENTRY_Mother_Basic_Design_OPTIMIZED.docx</w:t>
             </w:r>
           </w:p>
         </w:tc>
@@ -5990,7 +5990,7 @@
                 <w:color w:val="171A2B"/>
                 <w:sz w:val="11"/>
               </w:rPr>
-              <w:t>05_SYSTEM_LOGIC/20_SYSTEM-LOGIC_全站系統邏輯與共享 Runtime_AI Continuity_Mother_Compliant_Basic_Design.docx</w:t>
+              <w:t>ACPOS_SYSTEM_LOGIC_GLOBAL_INTEGRATION_Mother_Basic_Design_OPTIMIZED.docx</w:t>
             </w:r>
           </w:p>
         </w:tc>
@@ -8048,6 +8048,272 @@
                 <w:sz w:val="12"/>
               </w:rPr>
               <w:t>Any embedded branch/SHA/count that conflicts with the fresh physical scan is historical evidence only, not Current package authority.</w:t>
+            </w:r>
+          </w:p>
+        </w:tc>
+      </w:tr>
+    </w:tbl>
+    <w:p>
+      <w:pPr>
+        <w:pStyle w:val="Heading2"/>
+      </w:pPr>
+      <w:r>
+        <w:t>Current Supporting Word Corpus｜目前支援設計文件</w:t>
+      </w:r>
+    </w:p>
+    <w:p>
+      <w:r>
+        <w:t>[ACPOS-CURRENT-SUPPORTING-WORD-CORPUS-V1] Package denominator = 31 Word files = 1 Index + 20 page/login/global-integration entries + 10 supporting design/system-contract files.</w:t>
+      </w:r>
+    </w:p>
+    <w:tbl>
+      <w:tblPr>
+        <w:tblStyle w:val="TableGrid"/>
+        <w:tblW w:type="auto" w:w="0"/>
+        <w:tblLook w:firstColumn="1" w:firstRow="1" w:lastColumn="0" w:lastRow="0" w:noHBand="0" w:noVBand="1" w:val="04A0"/>
+      </w:tblPr>
+      <w:tblGrid>
+        <w:gridCol w:w="5349"/>
+        <w:gridCol w:w="5349"/>
+      </w:tblGrid>
+      <w:tr>
+        <w:tc>
+          <w:tcPr>
+            <w:tcW w:type="dxa" w:w="5349"/>
+          </w:tcPr>
+          <w:p>
+            <w:r>
+              <w:t>Document Role</w:t>
+            </w:r>
+          </w:p>
+        </w:tc>
+        <w:tc>
+          <w:tcPr>
+            <w:tcW w:type="dxa" w:w="5349"/>
+          </w:tcPr>
+          <w:p>
+            <w:r>
+              <w:t>Current Root Filename</w:t>
+            </w:r>
+          </w:p>
+        </w:tc>
+      </w:tr>
+      <w:tr>
+        <w:tc>
+          <w:tcPr>
+            <w:tcW w:type="dxa" w:w="5349"/>
+          </w:tcPr>
+          <w:p>
+            <w:r>
+              <w:t>Global Home / Shell / Navigation</w:t>
+            </w:r>
+          </w:p>
+        </w:tc>
+        <w:tc>
+          <w:tcPr>
+            <w:tcW w:type="dxa" w:w="5349"/>
+          </w:tcPr>
+          <w:p>
+            <w:r>
+              <w:t>ACPOS_GLOBAL_HOME_SHELL_NAVIGATION_Mother_Basic_Design_OPTIMIZED.docx</w:t>
+            </w:r>
+          </w:p>
+        </w:tc>
+      </w:tr>
+      <w:tr>
+        <w:tc>
+          <w:tcPr>
+            <w:tcW w:type="dxa" w:w="5349"/>
+          </w:tcPr>
+          <w:p>
+            <w:r>
+              <w:t>System Contract 01</w:t>
+            </w:r>
+          </w:p>
+        </w:tc>
+        <w:tc>
+          <w:tcPr>
+            <w:tcW w:type="dxa" w:w="5349"/>
+          </w:tcPr>
+          <w:p>
+            <w:r>
+              <w:t>01_ACPOS_Global_Intelligent_Brain_Information_Lifecycle_Mother_Basic_Logic_Design_Normative_Contract_v4.docx</w:t>
+            </w:r>
+          </w:p>
+        </w:tc>
+      </w:tr>
+      <w:tr>
+        <w:tc>
+          <w:tcPr>
+            <w:tcW w:type="dxa" w:w="5349"/>
+          </w:tcPr>
+          <w:p>
+            <w:r>
+              <w:t>System Contract 02</w:t>
+            </w:r>
+          </w:p>
+        </w:tc>
+        <w:tc>
+          <w:tcPr>
+            <w:tcW w:type="dxa" w:w="5349"/>
+          </w:tcPr>
+          <w:p>
+            <w:r>
+              <w:t>02_ACPOS_AI_Conversation_Memory_MultiAI_Assistant_Mother_Basic_Logic_Design_Normative_Contract_v1.0.docx</w:t>
+            </w:r>
+          </w:p>
+        </w:tc>
+      </w:tr>
+      <w:tr>
+        <w:tc>
+          <w:tcPr>
+            <w:tcW w:type="dxa" w:w="5349"/>
+          </w:tcPr>
+          <w:p>
+            <w:r>
+              <w:t>System Contract 03</w:t>
+            </w:r>
+          </w:p>
+        </w:tc>
+        <w:tc>
+          <w:tcPr>
+            <w:tcW w:type="dxa" w:w="5349"/>
+          </w:tcPr>
+          <w:p>
+            <w:r>
+              <w:t>03_ACPOS_AI_Execution_Script_Compiler_Tool_AIAPI_Runtime_Mother_Basic_Logic_Design_Normative_Contract_v1.0.docx</w:t>
+            </w:r>
+          </w:p>
+        </w:tc>
+      </w:tr>
+      <w:tr>
+        <w:tc>
+          <w:tcPr>
+            <w:tcW w:type="dxa" w:w="5349"/>
+          </w:tcPr>
+          <w:p>
+            <w:r>
+              <w:t>System Contract 04</w:t>
+            </w:r>
+          </w:p>
+        </w:tc>
+        <w:tc>
+          <w:tcPr>
+            <w:tcW w:type="dxa" w:w="5349"/>
+          </w:tcPr>
+          <w:p>
+            <w:r>
+              <w:t>04_ACPOS_CORE_AI_Blueprint_Canonical_Script_System_Mother_Basic_Logic_Design_Normative_Contract_v1.0.docx</w:t>
+            </w:r>
+          </w:p>
+        </w:tc>
+      </w:tr>
+      <w:tr>
+        <w:tc>
+          <w:tcPr>
+            <w:tcW w:type="dxa" w:w="5349"/>
+          </w:tcPr>
+          <w:p>
+            <w:r>
+              <w:t>System Contract 05</w:t>
+            </w:r>
+          </w:p>
+        </w:tc>
+        <w:tc>
+          <w:tcPr>
+            <w:tcW w:type="dxa" w:w="5349"/>
+          </w:tcPr>
+          <w:p>
+            <w:r>
+              <w:t>05_ACPOS_Creative_Production_AI_ASSET_VIDEO_EDIT_VOICE_QA_Mother_Basic_Logic_Design_Normative_Contract_v1.0.docx</w:t>
+            </w:r>
+          </w:p>
+        </w:tc>
+      </w:tr>
+      <w:tr>
+        <w:tc>
+          <w:tcPr>
+            <w:tcW w:type="dxa" w:w="5349"/>
+          </w:tcPr>
+          <w:p>
+            <w:r>
+              <w:t>System Contract 06</w:t>
+            </w:r>
+          </w:p>
+        </w:tc>
+        <w:tc>
+          <w:tcPr>
+            <w:tcW w:type="dxa" w:w="5349"/>
+          </w:tcPr>
+          <w:p>
+            <w:r>
+              <w:t>06_ACPOS_Enterprise_Business_Development_AI_System_Mother_Basic_Logic_Design_Normative_Contract_v1.0.docx</w:t>
+            </w:r>
+          </w:p>
+        </w:tc>
+      </w:tr>
+      <w:tr>
+        <w:tc>
+          <w:tcPr>
+            <w:tcW w:type="dxa" w:w="5349"/>
+          </w:tcPr>
+          <w:p>
+            <w:r>
+              <w:t>System Contract 07</w:t>
+            </w:r>
+          </w:p>
+        </w:tc>
+        <w:tc>
+          <w:tcPr>
+            <w:tcW w:type="dxa" w:w="5349"/>
+          </w:tcPr>
+          <w:p>
+            <w:r>
+              <w:t>07_ACPOS_Social_Publishing_AI_System_Mother_Basic_Logic_Design_Normative_Contract_v1.0.docx</w:t>
+            </w:r>
+          </w:p>
+        </w:tc>
+      </w:tr>
+      <w:tr>
+        <w:tc>
+          <w:tcPr>
+            <w:tcW w:type="dxa" w:w="5349"/>
+          </w:tcPr>
+          <w:p>
+            <w:r>
+              <w:t>System Contract 08</w:t>
+            </w:r>
+          </w:p>
+        </w:tc>
+        <w:tc>
+          <w:tcPr>
+            <w:tcW w:type="dxa" w:w="5349"/>
+          </w:tcPr>
+          <w:p>
+            <w:r>
+              <w:t>08_ACPOS_Strategy_Intelligence_MultiAI_Decision_System_Mother_Basic_Logic_Design_Normative_Contract_v1.0.docx</w:t>
+            </w:r>
+          </w:p>
+        </w:tc>
+      </w:tr>
+      <w:tr>
+        <w:tc>
+          <w:tcPr>
+            <w:tcW w:type="dxa" w:w="5349"/>
+          </w:tcPr>
+          <w:p>
+            <w:r>
+              <w:t>System Contract 09</w:t>
+            </w:r>
+          </w:p>
+        </w:tc>
+        <w:tc>
+          <w:tcPr>
+            <w:tcW w:type="dxa" w:w="5349"/>
+          </w:tcPr>
+          <w:p>
+            <w:r>
+              <w:t>09_ACPOS_AI_System_Engineer_Self_Inspection_Evolution_System_Mother_Basic_Logic_Design_Normative_Contract_v1.0.docx</w:t>
             </w:r>
           </w:p>
         </w:tc>

</xml_diff>